<commit_message>
docs(v18): actualizar guia de integracion Meta handoff (deteccion mediada por backend)
</commit_message>
<xml_diff>
--- a/docs/integraciones/meta_lead_handoff.docx
+++ b/docs/integraciones/meta_lead_handoff.docx
@@ -2,7 +2,7 @@
 <file path=word/document.xml><?xml version="1.0" encoding="utf-8"?>
 <w:document xmlns:w="http://schemas.openxmlformats.org/wordprocessingml/2006/main" xmlns:m="http://schemas.openxmlformats.org/officeDocument/2006/math" xmlns:r="http://schemas.openxmlformats.org/officeDocument/2006/relationships" xmlns:o="urn:schemas-microsoft-com:office:office" xmlns:v="urn:schemas-microsoft-com:vml" xmlns:w10="urn:schemas-microsoft-com:office:word" xmlns:a="http://schemas.openxmlformats.org/drawingml/2006/main" xmlns:pic="http://schemas.openxmlformats.org/drawingml/2006/picture" xmlns:wp="http://schemas.openxmlformats.org/drawingml/2006/wordprocessingDrawing">
   <w:body>
-    <w:bookmarkStart w:id="41" w:name="X129b9b59126c26e1b712ed74776e4afd24aaaf2"/>
+    <w:bookmarkStart w:id="42" w:name="X129b9b59126c26e1b712ed74776e4afd24aaaf2"/>
     <w:p>
       <w:pPr>
         <w:pStyle w:val="Heading1"/>
@@ -92,7 +92,37 @@
         <w:rPr>
           <w:rStyle w:val="VerbatimChar"/>
         </w:rPr>
-        <w:t xml:space="preserve">salesiq/message_handler_v17_meta_aware.deluge</w:t>
+        <w:t xml:space="preserve">salesiq/message_handler_v18_meta_aware.deluge</w:t>
+      </w:r>
+      <w:r>
+        <w:t xml:space="preserve"> </w:t>
+      </w:r>
+      <w:r>
+        <w:t xml:space="preserve">·</w:t>
+      </w:r>
+      <w:r>
+        <w:t xml:space="preserve"> </w:t>
+      </w:r>
+      <w:r>
+        <w:rPr>
+          <w:rStyle w:val="VerbatimChar"/>
+        </w:rPr>
+        <w:t xml:space="preserve">server.js</w:t>
+      </w:r>
+      <w:r>
+        <w:t xml:space="preserve"> </w:t>
+      </w:r>
+      <w:r>
+        <w:t xml:space="preserve">(</w:t>
+      </w:r>
+      <w:r>
+        <w:rPr>
+          <w:rStyle w:val="VerbatimChar"/>
+        </w:rPr>
+        <w:t xml:space="preserve">/meta-context</w:t>
+      </w:r>
+      <w:r>
+        <w:t xml:space="preserve">)</w:t>
       </w:r>
     </w:p>
     <w:p>
@@ -102,13 +132,13 @@
         </w:pict>
       </w:r>
     </w:p>
-    <w:bookmarkStart w:id="21" w:name="problema-que-resuelve"/>
+    <w:bookmarkStart w:id="20" w:name="X61614a7d5492834ad405ca2816e8336a6956ac1"/>
     <w:p>
       <w:pPr>
         <w:pStyle w:val="Heading2"/>
       </w:pPr>
       <w:r>
-        <w:t xml:space="preserve">🎯 Problema que resuelve</w:t>
+        <w:t xml:space="preserve">⚠️ ACTUALIZACIÓN v18 — Detección mediada por backend (lee primero)</w:t>
       </w:r>
     </w:p>
     <w:p>
@@ -116,7 +146,34 @@
         <w:pStyle w:val="FirstParagraph"/>
       </w:pPr>
       <w:r>
-        <w:t xml:space="preserve">Los leads que completan el cuestionario de</w:t>
+        <w:t xml:space="preserve">La versión v17 dependía de leer un campo personalizado (</w:t>
+      </w:r>
+      <w:r>
+        <w:rPr>
+          <w:rStyle w:val="VerbatimChar"/>
+        </w:rPr>
+        <w:t xml:space="preserve">kvn_meta</w:t>
+      </w:r>
+      <w:r>
+        <w:t xml:space="preserve">) inyectado en</w:t>
+      </w:r>
+      <w:r>
+        <w:t xml:space="preserve"> </w:t>
+      </w:r>
+      <w:r>
+        <w:t xml:space="preserve">SalesIQ con</w:t>
+      </w:r>
+      <w:r>
+        <w:t xml:space="preserve"> </w:t>
+      </w:r>
+      <w:r>
+        <w:rPr>
+          <w:rStyle w:val="VerbatimChar"/>
+        </w:rPr>
+        <w:t xml:space="preserve">$zoho.salesiq.visitor.info()</w:t>
+      </w:r>
+      <w:r>
+        <w:t xml:space="preserve">.</w:t>
       </w:r>
       <w:r>
         <w:t xml:space="preserve"> </w:t>
@@ -126,69 +183,13 @@
           <w:bCs/>
           <w:b/>
         </w:rPr>
-        <w:t xml:space="preserve">Meta (Instant Form / Messenger)</w:t>
-      </w:r>
-      <w:r>
-        <w:t xml:space="preserve"> </w:t>
-      </w:r>
-      <w:r>
-        <w:t xml:space="preserve">—tipo de uniforme, cantidad de personas, fecha de entrega, estado del diseño, nombre/email/teléfono— llegan a la landing</w:t>
-      </w:r>
-      <w:r>
-        <w:t xml:space="preserve"> </w:t>
-      </w:r>
-      <w:r>
-        <w:rPr>
-          <w:rStyle w:val="VerbatimChar"/>
-        </w:rPr>
-        <w:t xml:space="preserve">https://www.kavensports.com/catalogo-ciclismo</w:t>
-      </w:r>
-      <w:r>
-        <w:t xml:space="preserve"> </w:t>
-      </w:r>
-      <w:r>
-        <w:t xml:space="preserve">y</w:t>
-      </w:r>
-      <w:r>
-        <w:t xml:space="preserve"> </w:t>
+        <w:t xml:space="preserve">En pruebas se confirmó que Zoho</w:t>
       </w:r>
       <w:r>
         <w:rPr>
           <w:bCs/>
           <w:b/>
         </w:rPr>
-        <w:t xml:space="preserve">el Zobot les vuelve a hacer las MISMAS preguntas</w:t>
-      </w:r>
-      <w:r>
-        <w:t xml:space="preserve">.</w:t>
-      </w:r>
-    </w:p>
-    <w:p>
-      <w:pPr>
-        <w:pStyle w:val="BodyText"/>
-      </w:pPr>
-      <w:r>
-        <w:t xml:space="preserve">Esto genera fricción, sensación de</w:t>
-      </w:r>
-      <w:r>
-        <w:t xml:space="preserve"> </w:t>
-      </w:r>
-      <w:r>
-        <w:t xml:space="preserve">“</w:t>
-      </w:r>
-      <w:r>
-        <w:t xml:space="preserve">no me escucharon</w:t>
-      </w:r>
-      <w:r>
-        <w:t xml:space="preserve">”</w:t>
-      </w:r>
-      <w:r>
-        <w:t xml:space="preserve"> </w:t>
-      </w:r>
-      <w:r>
-        <w:t xml:space="preserve">y</w:t>
-      </w:r>
-      <w:r>
         <w:t xml:space="preserve"> </w:t>
       </w:r>
       <w:r>
@@ -196,13 +197,377 @@
           <w:bCs/>
           <w:b/>
         </w:rPr>
+        <w:t xml:space="preserve">SalesIQ NO entrega los campos personalizados al handler Deluge del Zobot</w:t>
+      </w:r>
+      <w:r>
+        <w:t xml:space="preserve"> </w:t>
+      </w:r>
+      <w:r>
+        <w:t xml:space="preserve">— solo</w:t>
+      </w:r>
+      <w:r>
+        <w:t xml:space="preserve"> </w:t>
+      </w:r>
+      <w:r>
+        <w:t xml:space="preserve">entrega los campos estándar (nombre, teléfono, email). Por eso la detección v17</w:t>
+      </w:r>
+      <w:r>
+        <w:t xml:space="preserve"> </w:t>
+      </w:r>
+      <w:r>
+        <w:t xml:space="preserve">nunca se activaba y el bot caía al flujo genérico re-preguntando todo.</w:t>
+      </w:r>
+    </w:p>
+    <w:p>
+      <w:pPr>
+        <w:pStyle w:val="BodyText"/>
+      </w:pPr>
+      <w:r>
+        <w:rPr>
+          <w:bCs/>
+          <w:b/>
+        </w:rPr>
+        <w:t xml:space="preserve">Solución v18 (canal confiable, en producción):</w:t>
+      </w:r>
+      <w:r>
+        <w:t xml:space="preserve"> </w:t>
+      </w:r>
+      <w:r>
+        <w:t xml:space="preserve">1.</w:t>
+      </w:r>
+      <w:r>
+        <w:t xml:space="preserve"> </w:t>
+      </w:r>
+      <w:r>
+        <w:rPr>
+          <w:rStyle w:val="VerbatimChar"/>
+        </w:rPr>
+        <w:t xml:space="preserve">landing/meta-lead-context.js</w:t>
+      </w:r>
+      <w:r>
+        <w:t xml:space="preserve"> </w:t>
+      </w:r>
+      <w:r>
+        <w:t xml:space="preserve">ahora, además de inyectar los campos estándar,</w:t>
+      </w:r>
+      <w:r>
+        <w:t xml:space="preserve"> </w:t>
+      </w:r>
+      <w:r>
+        <w:t xml:space="preserve">hace</w:t>
+      </w:r>
+      <w:r>
+        <w:t xml:space="preserve"> </w:t>
+      </w:r>
+      <w:r>
+        <w:rPr>
+          <w:rStyle w:val="VerbatimChar"/>
+        </w:rPr>
+        <w:t xml:space="preserve">POST https://kaven-bot.onrender.com/meta-context</w:t>
+      </w:r>
+      <w:r>
+        <w:t xml:space="preserve"> </w:t>
+      </w:r>
+      <w:r>
+        <w:t xml:space="preserve">con todo el contexto</w:t>
+      </w:r>
+      <w:r>
+        <w:t xml:space="preserve"> </w:t>
+      </w:r>
+      <w:r>
+        <w:t xml:space="preserve">del lead de Meta.</w:t>
+      </w:r>
+      <w:r>
+        <w:t xml:space="preserve"> </w:t>
+      </w:r>
+      <w:r>
+        <w:t xml:space="preserve">2.</w:t>
+      </w:r>
+      <w:r>
+        <w:t xml:space="preserve"> </w:t>
+      </w:r>
+      <w:r>
+        <w:rPr>
+          <w:rStyle w:val="VerbatimChar"/>
+        </w:rPr>
+        <w:t xml:space="preserve">server.js</w:t>
+      </w:r>
+      <w:r>
+        <w:t xml:space="preserve"> </w:t>
+      </w:r>
+      <w:r>
+        <w:t xml:space="preserve">expone</w:t>
+      </w:r>
+      <w:r>
+        <w:t xml:space="preserve"> </w:t>
+      </w:r>
+      <w:r>
+        <w:rPr>
+          <w:rStyle w:val="VerbatimChar"/>
+        </w:rPr>
+        <w:t xml:space="preserve">POST /meta-context</w:t>
+      </w:r>
+      <w:r>
+        <w:t xml:space="preserve"> </w:t>
+      </w:r>
+      <w:r>
+        <w:t xml:space="preserve">(guarda en memoria, indexado por</w:t>
+      </w:r>
+      <w:r>
+        <w:t xml:space="preserve"> </w:t>
+      </w:r>
+      <w:r>
+        <w:t xml:space="preserve">teléfono y nombre normalizados, TTL 24h) y</w:t>
+      </w:r>
+      <w:r>
+        <w:t xml:space="preserve"> </w:t>
+      </w:r>
+      <w:r>
+        <w:rPr>
+          <w:rStyle w:val="VerbatimChar"/>
+        </w:rPr>
+        <w:t xml:space="preserve">GET /meta-context?name=&amp;phone=</w:t>
+      </w:r>
+      <w:r>
+        <w:t xml:space="preserve">.</w:t>
+      </w:r>
+      <w:r>
+        <w:t xml:space="preserve"> </w:t>
+      </w:r>
+      <w:r>
+        <w:t xml:space="preserve">3.</w:t>
+      </w:r>
+      <w:r>
+        <w:t xml:space="preserve"> </w:t>
+      </w:r>
+      <w:r>
+        <w:rPr>
+          <w:rStyle w:val="VerbatimChar"/>
+        </w:rPr>
+        <w:t xml:space="preserve">salesiq/message_handler_v18_meta_aware.deluge</w:t>
+      </w:r>
+      <w:r>
+        <w:t xml:space="preserve"> </w:t>
+      </w:r>
+      <w:r>
+        <w:t xml:space="preserve">lee</w:t>
+      </w:r>
+      <w:r>
+        <w:t xml:space="preserve"> </w:t>
+      </w:r>
+      <w:r>
+        <w:rPr>
+          <w:rStyle w:val="VerbatimChar"/>
+        </w:rPr>
+        <w:t xml:space="preserve">visitor.get("name")</w:t>
+      </w:r>
+      <w:r>
+        <w:t xml:space="preserve"> </w:t>
+      </w:r>
+      <w:r>
+        <w:t xml:space="preserve">/</w:t>
+      </w:r>
+      <w:r>
+        <w:t xml:space="preserve"> </w:t>
+      </w:r>
+      <w:r>
+        <w:rPr>
+          <w:rStyle w:val="VerbatimChar"/>
+        </w:rPr>
+        <w:t xml:space="preserve">visitor.get("phone")</w:t>
+      </w:r>
+      <w:r>
+        <w:t xml:space="preserve"> </w:t>
+      </w:r>
+      <w:r>
+        <w:t xml:space="preserve">(campos estándar que SÍ llegan) y consulta</w:t>
+      </w:r>
+      <w:r>
+        <w:t xml:space="preserve"> </w:t>
+      </w:r>
+      <w:r>
+        <w:rPr>
+          <w:rStyle w:val="VerbatimChar"/>
+        </w:rPr>
+        <w:t xml:space="preserve">GET /meta-context</w:t>
+      </w:r>
+      <w:r>
+        <w:t xml:space="preserve">. Si el visitante es de Meta → saludo personalizado, sin</w:t>
+      </w:r>
+      <w:r>
+        <w:t xml:space="preserve"> </w:t>
+      </w:r>
+      <w:r>
+        <w:t xml:space="preserve">formulario, lead único en CRM. El resultado se cachea en la sesión del chat.</w:t>
+      </w:r>
+    </w:p>
+    <w:p>
+      <w:pPr>
+        <w:pStyle w:val="BodyText"/>
+      </w:pPr>
+      <w:r>
+        <w:t xml:space="preserve">Guía de publicación paso a paso:</w:t>
+      </w:r>
+      <w:r>
+        <w:t xml:space="preserve"> </w:t>
+      </w:r>
+      <w:r>
+        <w:rPr>
+          <w:rStyle w:val="VerbatimChar"/>
+          <w:bCs/>
+          <w:b/>
+        </w:rPr>
+        <w:t xml:space="preserve">/home/ubuntu/INSTRUCCIONES_PUBLICAR_V18.md</w:t>
+      </w:r>
+      <w:r>
+        <w:t xml:space="preserve">.</w:t>
+      </w:r>
+    </w:p>
+    <w:p>
+      <w:pPr>
+        <w:pStyle w:val="BlockText"/>
+      </w:pPr>
+      <w:r>
+        <w:t xml:space="preserve">El resto de este documento describe el diseño original v17; el flujo y los</w:t>
+      </w:r>
+      <w:r>
+        <w:t xml:space="preserve"> </w:t>
+      </w:r>
+      <w:r>
+        <w:t xml:space="preserve">textos del saludo siguen vigentes, solo cambió</w:t>
+      </w:r>
+      <w:r>
+        <w:t xml:space="preserve"> </w:t>
+      </w:r>
+      <w:r>
+        <w:rPr>
+          <w:bCs/>
+          <w:b/>
+        </w:rPr>
+        <w:t xml:space="preserve">cómo</w:t>
+      </w:r>
+      <w:r>
+        <w:t xml:space="preserve"> </w:t>
+      </w:r>
+      <w:r>
+        <w:t xml:space="preserve">el handler descubre al</w:t>
+      </w:r>
+      <w:r>
+        <w:t xml:space="preserve"> </w:t>
+      </w:r>
+      <w:r>
+        <w:t xml:space="preserve">lead de Meta (backend en vez de campo personalizado).</w:t>
+      </w:r>
+    </w:p>
+    <w:p>
+      <w:r>
+        <w:pict>
+          <v:rect style="width:0;height:1.5pt" o:hralign="center" o:hrstd="t" o:hr="t"/>
+        </w:pict>
+      </w:r>
+    </w:p>
+    <w:bookmarkEnd w:id="20"/>
+    <w:bookmarkStart w:id="22" w:name="problema-que-resuelve"/>
+    <w:p>
+      <w:pPr>
+        <w:pStyle w:val="Heading2"/>
+      </w:pPr>
+      <w:r>
+        <w:t xml:space="preserve">🎯 Problema que resuelve</w:t>
+      </w:r>
+    </w:p>
+    <w:p>
+      <w:pPr>
+        <w:pStyle w:val="FirstParagraph"/>
+      </w:pPr>
+      <w:r>
+        <w:t xml:space="preserve">Los leads que completan el cuestionario de</w:t>
+      </w:r>
+      <w:r>
+        <w:t xml:space="preserve"> </w:t>
+      </w:r>
+      <w:r>
+        <w:rPr>
+          <w:bCs/>
+          <w:b/>
+        </w:rPr>
+        <w:t xml:space="preserve">Meta (Instant Form / Messenger)</w:t>
+      </w:r>
+      <w:r>
+        <w:t xml:space="preserve"> </w:t>
+      </w:r>
+      <w:r>
+        <w:t xml:space="preserve">—tipo de uniforme, cantidad de personas, fecha de entrega, estado del diseño, nombre/email/teléfono— llegan a la landing</w:t>
+      </w:r>
+      <w:r>
+        <w:t xml:space="preserve"> </w:t>
+      </w:r>
+      <w:r>
+        <w:rPr>
+          <w:rStyle w:val="VerbatimChar"/>
+        </w:rPr>
+        <w:t xml:space="preserve">https://www.kavensports.com/catalogo-ciclismo</w:t>
+      </w:r>
+      <w:r>
+        <w:t xml:space="preserve"> </w:t>
+      </w:r>
+      <w:r>
+        <w:t xml:space="preserve">y</w:t>
+      </w:r>
+      <w:r>
+        <w:t xml:space="preserve"> </w:t>
+      </w:r>
+      <w:r>
+        <w:rPr>
+          <w:bCs/>
+          <w:b/>
+        </w:rPr>
+        <w:t xml:space="preserve">el Zobot les vuelve a hacer las MISMAS preguntas</w:t>
+      </w:r>
+      <w:r>
+        <w:t xml:space="preserve">.</w:t>
+      </w:r>
+    </w:p>
+    <w:p>
+      <w:pPr>
+        <w:pStyle w:val="BodyText"/>
+      </w:pPr>
+      <w:r>
+        <w:t xml:space="preserve">Esto genera fricción, sensación de</w:t>
+      </w:r>
+      <w:r>
+        <w:t xml:space="preserve"> </w:t>
+      </w:r>
+      <w:r>
+        <w:t xml:space="preserve">“</w:t>
+      </w:r>
+      <w:r>
+        <w:t xml:space="preserve">no me escucharon</w:t>
+      </w:r>
+      <w:r>
+        <w:t xml:space="preserve">”</w:t>
+      </w:r>
+      <w:r>
+        <w:t xml:space="preserve"> </w:t>
+      </w:r>
+      <w:r>
+        <w:t xml:space="preserve">y</w:t>
+      </w:r>
+      <w:r>
+        <w:t xml:space="preserve"> </w:t>
+      </w:r>
+      <w:r>
+        <w:rPr>
+          <w:bCs/>
+          <w:b/>
+        </w:rPr>
         <w:t xml:space="preserve">pérdida de leads calientes</w:t>
       </w:r>
       <w:r>
         <w:t xml:space="preserve">.</w:t>
       </w:r>
     </w:p>
-    <w:bookmarkStart w:id="20" w:name="causa-raíz-del-análisis-previo"/>
+    <w:bookmarkStart w:id="21" w:name="causa-raíz-del-análisis-previo"/>
     <w:p>
       <w:pPr>
         <w:pStyle w:val="Heading3"/>
@@ -264,9 +629,9 @@
         </w:pict>
       </w:r>
     </w:p>
-    <w:bookmarkEnd w:id="20"/>
     <w:bookmarkEnd w:id="21"/>
-    <w:bookmarkStart w:id="22" w:name="solución-arquitectura"/>
+    <w:bookmarkEnd w:id="22"/>
+    <w:bookmarkStart w:id="23" w:name="solución-arquitectura"/>
     <w:p>
       <w:pPr>
         <w:pStyle w:val="Heading2"/>
@@ -534,8 +899,8 @@
         </w:pict>
       </w:r>
     </w:p>
-    <w:bookmarkEnd w:id="22"/>
-    <w:bookmarkStart w:id="25" w:name="X08ffd030f3d68401f4ffba2f1224906a121c404"/>
+    <w:bookmarkEnd w:id="23"/>
+    <w:bookmarkStart w:id="26" w:name="X08ffd030f3d68401f4ffba2f1224906a121c404"/>
     <w:p>
       <w:pPr>
         <w:pStyle w:val="Heading2"/>
@@ -565,7 +930,7 @@
         <w:t xml:space="preserve">.</w:t>
       </w:r>
     </w:p>
-    <w:bookmarkStart w:id="23" w:name="url-recomendada"/>
+    <w:bookmarkStart w:id="24" w:name="url-recomendada"/>
     <w:p>
       <w:pPr>
         <w:pStyle w:val="Heading3"/>
@@ -585,8 +950,8 @@
         <w:t xml:space="preserve">https://www.kavensports.com/catalogo-ciclismo?source=meta&amp;name={{full_name}}&amp;phone={{phone_number}}&amp;email={{email}}&amp;sport={{tipo_uniforme}}&amp;quantity={{cantidad}}&amp;date={{fecha_entrega}}&amp;design={{estado_diseno}}&amp;campaign=cycling_2026&amp;lang=es</w:t>
       </w:r>
     </w:p>
-    <w:bookmarkEnd w:id="23"/>
-    <w:bookmarkStart w:id="24" w:name="parámetros-aceptados"/>
+    <w:bookmarkEnd w:id="24"/>
+    <w:bookmarkStart w:id="25" w:name="parámetros-aceptados"/>
     <w:p>
       <w:pPr>
         <w:pStyle w:val="Heading3"/>
@@ -1448,9 +1813,9 @@
         </w:pict>
       </w:r>
     </w:p>
-    <w:bookmarkEnd w:id="24"/>
     <w:bookmarkEnd w:id="25"/>
-    <w:bookmarkStart w:id="30" w:name="desplegar-el-script-en-la-landing"/>
+    <w:bookmarkEnd w:id="26"/>
+    <w:bookmarkStart w:id="31" w:name="desplegar-el-script-en-la-landing"/>
     <w:p>
       <w:pPr>
         <w:pStyle w:val="Heading2"/>
@@ -1479,7 +1844,7 @@
         <w:t xml:space="preserve">.</w:t>
       </w:r>
     </w:p>
-    <w:bookmarkStart w:id="26" w:name="opción-a-archivo-externo-recomendado"/>
+    <w:bookmarkStart w:id="27" w:name="opción-a-archivo-externo-recomendado"/>
     <w:p>
       <w:pPr>
         <w:pStyle w:val="Heading3"/>
@@ -1653,8 +2018,8 @@
         <w:t xml:space="preserve">&gt;&lt;/script&gt;</w:t>
       </w:r>
     </w:p>
-    <w:bookmarkEnd w:id="26"/>
-    <w:bookmarkStart w:id="27" w:name="opción-b-inline"/>
+    <w:bookmarkEnd w:id="27"/>
+    <w:bookmarkStart w:id="28" w:name="opción-b-inline"/>
     <w:p>
       <w:pPr>
         <w:pStyle w:val="Heading3"/>
@@ -1698,8 +2063,8 @@
         <w:t xml:space="preserve">, después del snippet de SalesIQ.</w:t>
       </w:r>
     </w:p>
-    <w:bookmarkEnd w:id="27"/>
-    <w:bookmarkStart w:id="28" w:name="requisitos-de-orden"/>
+    <w:bookmarkEnd w:id="28"/>
+    <w:bookmarkStart w:id="29" w:name="requisitos-de-orden"/>
     <w:p>
       <w:pPr>
         <w:pStyle w:val="Heading3"/>
@@ -1766,8 +2131,8 @@
         <w:t xml:space="preserve">exista antes de inyectar, así que el orden exacto no rompe nada, pero lo ideal es: SalesIQ → meta-lead-context.js.</w:t>
       </w:r>
     </w:p>
-    <w:bookmarkEnd w:id="28"/>
-    <w:bookmarkStart w:id="29" w:name="X833334f1c89d3b187b51de1009ff3c4d38b01ab"/>
+    <w:bookmarkEnd w:id="29"/>
+    <w:bookmarkStart w:id="30" w:name="X833334f1c89d3b187b51de1009ff3c4d38b01ab"/>
     <w:p>
       <w:pPr>
         <w:pStyle w:val="Heading3"/>
@@ -1998,9 +2363,9 @@
         </w:pict>
       </w:r>
     </w:p>
-    <w:bookmarkEnd w:id="29"/>
     <w:bookmarkEnd w:id="30"/>
-    <w:bookmarkStart w:id="33" w:name="Xc430afc9da38d7a7e785cef1499ad281243f6cc"/>
+    <w:bookmarkEnd w:id="31"/>
+    <w:bookmarkStart w:id="34" w:name="Xc430afc9da38d7a7e785cef1499ad281243f6cc"/>
     <w:p>
       <w:pPr>
         <w:pStyle w:val="Heading2"/>
@@ -2019,7 +2384,7 @@
       <w:r>
         <w:t xml:space="preserve"> </w:t>
       </w:r>
-      <w:hyperlink r:id="rId31">
+      <w:hyperlink r:id="rId32">
         <w:r>
           <w:rPr>
             <w:rStyle w:val="VerbatimChar"/>
@@ -2305,7 +2670,7 @@
         <w:t xml:space="preserve">.</w:t>
       </w:r>
     </w:p>
-    <w:bookmarkStart w:id="32" w:name="comportamiento-esperado-del-bot-v17"/>
+    <w:bookmarkStart w:id="33" w:name="comportamiento-esperado-del-bot-v17"/>
     <w:p>
       <w:pPr>
         <w:pStyle w:val="Heading3"/>
@@ -2436,9 +2801,9 @@
         </w:pict>
       </w:r>
     </w:p>
-    <w:bookmarkEnd w:id="32"/>
     <w:bookmarkEnd w:id="33"/>
-    <w:bookmarkStart w:id="38" w:name="testing-checklist"/>
+    <w:bookmarkEnd w:id="34"/>
+    <w:bookmarkStart w:id="39" w:name="testing-checklist"/>
     <w:p>
       <w:pPr>
         <w:pStyle w:val="Heading2"/>
@@ -2447,7 +2812,7 @@
         <w:t xml:space="preserve">4️⃣ Testing checklist</w:t>
       </w:r>
     </w:p>
-    <w:bookmarkStart w:id="34" w:name="a.-script-en-la-landing"/>
+    <w:bookmarkStart w:id="35" w:name="a.-script-en-la-landing"/>
     <w:p>
       <w:pPr>
         <w:pStyle w:val="Heading3"/>
@@ -2626,8 +2991,8 @@
         <w:t xml:space="preserve">false</w:t>
       </w:r>
     </w:p>
-    <w:bookmarkEnd w:id="34"/>
-    <w:bookmarkStart w:id="35" w:name="b.-zobot-v17-lead-de-meta"/>
+    <w:bookmarkEnd w:id="35"/>
+    <w:bookmarkStart w:id="36" w:name="b.-zobot-v17-lead-de-meta"/>
     <w:p>
       <w:pPr>
         <w:pStyle w:val="Heading3"/>
@@ -2836,8 +3201,8 @@
         <w:t xml:space="preserve">☐ No se crea un lead duplicado (dedup del backend por teléfono→email)</w:t>
       </w:r>
     </w:p>
-    <w:bookmarkEnd w:id="35"/>
-    <w:bookmarkStart w:id="36" w:name="c.-zobot-v17-visitante-directo-regresión"/>
+    <w:bookmarkEnd w:id="36"/>
+    <w:bookmarkStart w:id="37" w:name="c.-zobot-v17-visitante-directo-regresión"/>
     <w:p>
       <w:pPr>
         <w:pStyle w:val="Heading3"/>
@@ -2916,8 +3281,8 @@
         <w:t xml:space="preserve">sigue activando el formulario normal</w:t>
       </w:r>
     </w:p>
-    <w:bookmarkEnd w:id="36"/>
-    <w:bookmarkStart w:id="37" w:name="d.-idioma"/>
+    <w:bookmarkEnd w:id="37"/>
+    <w:bookmarkStart w:id="38" w:name="d.-idioma"/>
     <w:p>
       <w:pPr>
         <w:pStyle w:val="Heading3"/>
@@ -3002,9 +3367,9 @@
         </w:pict>
       </w:r>
     </w:p>
-    <w:bookmarkEnd w:id="37"/>
     <w:bookmarkEnd w:id="38"/>
-    <w:bookmarkStart w:id="39" w:name="rollback"/>
+    <w:bookmarkEnd w:id="39"/>
+    <w:bookmarkStart w:id="40" w:name="rollback"/>
     <w:p>
       <w:pPr>
         <w:pStyle w:val="Heading2"/>
@@ -3116,8 +3481,8 @@
         </w:pict>
       </w:r>
     </w:p>
-    <w:bookmarkEnd w:id="39"/>
-    <w:bookmarkStart w:id="40" w:name="archivos-de-esta-integración"/>
+    <w:bookmarkEnd w:id="40"/>
+    <w:bookmarkStart w:id="41" w:name="archivos-de-esta-integración"/>
     <w:p>
       <w:pPr>
         <w:pStyle w:val="Heading2"/>
@@ -3303,8 +3668,8 @@
         <w:t xml:space="preserve">Kaven Sports Bot</w:t>
       </w:r>
     </w:p>
-    <w:bookmarkEnd w:id="40"/>
     <w:bookmarkEnd w:id="41"/>
+    <w:bookmarkEnd w:id="42"/>
     <w:sectPr/>
   </w:body>
 </w:document>

</xml_diff>